<commit_message>
Finalize AI4ML project state and ignore local artifacts
</commit_message>
<xml_diff>
--- a/MON-智算社区-2-需求-0420.docx
+++ b/MON-智算社区-2-需求-0420.docx
@@ -1,6 +1,6 @@
 
 <file path=word/document.xml><?xml version="1.0" encoding="utf-8"?>
-<w:document xmlns:wpc="http://schemas.microsoft.com/office/word/2010/wordprocessingCanvas" xmlns:cx="http://schemas.microsoft.com/office/drawing/2014/chartex" xmlns:cx1="http://schemas.microsoft.com/office/drawing/2015/9/8/chartex" xmlns:cx2="http://schemas.microsoft.com/office/drawing/2015/10/21/chartex" xmlns:cx3="http://schemas.microsoft.com/office/drawing/2016/5/9/chartex" xmlns:cx4="http://schemas.microsoft.com/office/drawing/2016/5/10/chartex" xmlns:cx5="http://schemas.microsoft.com/office/drawing/2016/5/11/chartex" xmlns:cx6="http://schemas.microsoft.com/office/drawing/2016/5/12/chartex" xmlns:cx7="http://schemas.microsoft.com/office/drawing/2016/5/13/chartex" xmlns:cx8="http://schemas.microsoft.com/office/drawing/2016/5/14/chartex" xmlns:mc="http://schemas.openxmlformats.org/markup-compatibility/2006" xmlns:aink="http://schemas.microsoft.com/office/drawing/2016/ink" xmlns:am3d="http://schemas.microsoft.com/office/drawing/2017/model3d" xmlns:o="urn:schemas-microsoft-com:office:office" xmlns:oel="http://schemas.microsoft.com/office/2019/extlst" xmlns:r="http://schemas.openxmlformats.org/officeDocument/2006/relationships" xmlns:m="http://schemas.openxmlformats.org/officeDocument/2006/math" xmlns:v="urn:schemas-microsoft-com:vml" xmlns:wp14="http://schemas.microsoft.com/office/word/2010/wordprocessingDrawing" xmlns:wp="http://schemas.openxmlformats.org/drawingml/2006/wordprocessingDrawing" xmlns:w10="urn:schemas-microsoft-com:office:word" xmlns:w="http://schemas.openxmlformats.org/wordprocessingml/2006/main" xmlns:w14="http://schemas.microsoft.com/office/word/2010/wordml" xmlns:w15="http://schemas.microsoft.com/office/word/2012/wordml" xmlns:w16cex="http://schemas.microsoft.com/office/word/2018/wordml/cex" xmlns:w16cid="http://schemas.microsoft.com/office/word/2016/wordml/cid" xmlns:w16="http://schemas.microsoft.com/office/word/2018/wordml" xmlns:w16du="http://schemas.microsoft.com/office/word/2023/wordml/word16du" xmlns:w16sdtdh="http://schemas.microsoft.com/office/word/2020/wordml/sdtdatahash" xmlns:w16sdtfl="http://schemas.microsoft.com/office/word/2024/wordml/sdtformatlock" xmlns:w16se="http://schemas.microsoft.com/office/word/2015/wordml/symex" xmlns:wpg="http://schemas.microsoft.com/office/word/2010/wordprocessingGroup" xmlns:wpi="http://schemas.microsoft.com/office/word/2010/wordprocessingInk" xmlns:wne="http://schemas.microsoft.com/office/word/2006/wordml" xmlns:wps="http://schemas.microsoft.com/office/word/2010/wordprocessingShape" mc:Ignorable="w14 w15 w16se w16cid w16 w16cex w16sdtdh w16sdtfl w16du wp14">
+<w:document xmlns:mc="http://schemas.openxmlformats.org/markup-compatibility/2006" xmlns:ns7="http://schemas.openxmlformats.org/drawingml/2006/main" xmlns:ns8="http://schemas.openxmlformats.org/drawingml/2006/picture" xmlns:ns9="http://schemas.microsoft.com/office/drawing/2016/SVG/main" xmlns:r="http://schemas.openxmlformats.org/officeDocument/2006/relationships" xmlns:w="http://schemas.openxmlformats.org/wordprocessingml/2006/main" xmlns:w14="http://schemas.microsoft.com/office/word/2010/wordml" xmlns:w15="http://schemas.microsoft.com/office/word/2012/wordml" xmlns:wp="http://schemas.openxmlformats.org/drawingml/2006/wordprocessingDrawing" xmlns:wp14="http://schemas.microsoft.com/office/word/2010/wordprocessingDrawing" mc:Ignorable="w14 w15 w16se w16cid w16 w16cex w16sdtdh w16sdtfl w16du wp14">
   <w:body>
     <w:p>
       <w:pPr>
@@ -8524,41 +8524,41 @@
             <wp:effectExtent l="0" t="0" r="15240" b="22225"/>
             <wp:docPr id="1" name="图片 1" descr="overview-architecture"/>
             <wp:cNvGraphicFramePr>
-              <a:graphicFrameLocks xmlns:a="http://schemas.openxmlformats.org/drawingml/2006/main" noChangeAspect="1"/>
+              <ns7:graphicFrameLocks noChangeAspect="1"/>
             </wp:cNvGraphicFramePr>
-            <a:graphic xmlns:a="http://schemas.openxmlformats.org/drawingml/2006/main">
-              <a:graphicData uri="http://schemas.openxmlformats.org/drawingml/2006/picture">
-                <pic:pic xmlns:pic="http://schemas.openxmlformats.org/drawingml/2006/picture">
-                  <pic:nvPicPr>
-                    <pic:cNvPr id="1" name="图片 1" descr="overview-architecture"/>
-                    <pic:cNvPicPr>
-                      <a:picLocks noChangeAspect="1"/>
-                    </pic:cNvPicPr>
-                  </pic:nvPicPr>
-                  <pic:blipFill>
-                    <a:blip r:embed="rId10">
-                      <a:extLst>
-                        <a:ext uri="{96DAC541-7B7A-43D3-8B79-37D633B846F1}">
-                          <asvg:svgBlip xmlns:asvg="http://schemas.microsoft.com/office/drawing/2016/SVG/main" r:embed="rId11"/>
-                        </a:ext>
-                      </a:extLst>
-                    </a:blip>
-                    <a:stretch>
-                      <a:fillRect/>
-                    </a:stretch>
-                  </pic:blipFill>
-                  <pic:spPr>
-                    <a:xfrm>
-                      <a:off x="0" y="0"/>
-                      <a:ext cx="5394960" cy="3101975"/>
-                    </a:xfrm>
-                    <a:prstGeom prst="rect">
-                      <a:avLst/>
-                    </a:prstGeom>
-                  </pic:spPr>
-                </pic:pic>
-              </a:graphicData>
-            </a:graphic>
+            <ns7:graphic>
+              <ns7:graphicData uri="http://schemas.openxmlformats.org/drawingml/2006/picture">
+                <ns8:pic>
+                  <ns8:nvPicPr>
+                    <ns8:cNvPr id="1" name="图片 1" descr="overview-architecture"/>
+                    <ns8:cNvPicPr>
+                      <ns7:picLocks noChangeAspect="1"/>
+                    </ns8:cNvPicPr>
+                  </ns8:nvPicPr>
+                  <ns8:blipFill>
+                    <ns7:blip r:embed="rId10">
+                      <ns7:extLst>
+                        <ns7:ext uri="{96DAC541-7B7A-43D3-8B79-37D633B846F1}">
+                          <ns9:svgBlip r:embed="rId11"/>
+                        </ns7:ext>
+                      </ns7:extLst>
+                    </ns7:blip>
+                    <ns7:stretch>
+                      <ns7:fillRect/>
+                    </ns7:stretch>
+                  </ns8:blipFill>
+                  <ns8:spPr>
+                    <ns7:xfrm>
+                      <ns7:off x="0" y="0"/>
+                      <ns7:ext cx="5394960" cy="3101975"/>
+                    </ns7:xfrm>
+                    <ns7:prstGeom prst="rect">
+                      <ns7:avLst/>
+                    </ns7:prstGeom>
+                  </ns8:spPr>
+                </ns8:pic>
+              </ns7:graphicData>
+            </ns7:graphic>
           </wp:inline>
         </w:drawing>
       </w:r>
@@ -8640,41 +8640,41 @@
             <wp:effectExtent l="0" t="0" r="7620" b="0"/>
             <wp:docPr id="203599200" name="图形 1"/>
             <wp:cNvGraphicFramePr>
-              <a:graphicFrameLocks xmlns:a="http://schemas.openxmlformats.org/drawingml/2006/main" noChangeAspect="1"/>
+              <ns7:graphicFrameLocks noChangeAspect="1"/>
             </wp:cNvGraphicFramePr>
-            <a:graphic xmlns:a="http://schemas.openxmlformats.org/drawingml/2006/main">
-              <a:graphicData uri="http://schemas.openxmlformats.org/drawingml/2006/picture">
-                <pic:pic xmlns:pic="http://schemas.openxmlformats.org/drawingml/2006/picture">
-                  <pic:nvPicPr>
-                    <pic:cNvPr id="203599200" name="图形 1"/>
-                    <pic:cNvPicPr>
-                      <a:picLocks noChangeAspect="1"/>
-                    </pic:cNvPicPr>
-                  </pic:nvPicPr>
-                  <pic:blipFill>
-                    <a:blip r:embed="rId12">
-                      <a:extLst>
-                        <a:ext uri="{96DAC541-7B7A-43D3-8B79-37D633B846F1}">
-                          <asvg:svgBlip xmlns:asvg="http://schemas.microsoft.com/office/drawing/2016/SVG/main" r:embed="rId13"/>
-                        </a:ext>
-                      </a:extLst>
-                    </a:blip>
-                    <a:stretch>
-                      <a:fillRect/>
-                    </a:stretch>
-                  </pic:blipFill>
-                  <pic:spPr>
-                    <a:xfrm>
-                      <a:off x="0" y="0"/>
-                      <a:ext cx="4151193" cy="6724068"/>
-                    </a:xfrm>
-                    <a:prstGeom prst="rect">
-                      <a:avLst/>
-                    </a:prstGeom>
-                  </pic:spPr>
-                </pic:pic>
-              </a:graphicData>
-            </a:graphic>
+            <ns7:graphic>
+              <ns7:graphicData uri="http://schemas.openxmlformats.org/drawingml/2006/picture">
+                <ns8:pic>
+                  <ns8:nvPicPr>
+                    <ns8:cNvPr id="203599200" name="图形 1"/>
+                    <ns8:cNvPicPr>
+                      <ns7:picLocks noChangeAspect="1"/>
+                    </ns8:cNvPicPr>
+                  </ns8:nvPicPr>
+                  <ns8:blipFill>
+                    <ns7:blip r:embed="rId12">
+                      <ns7:extLst>
+                        <ns7:ext uri="{96DAC541-7B7A-43D3-8B79-37D633B846F1}">
+                          <ns9:svgBlip r:embed="rId13"/>
+                        </ns7:ext>
+                      </ns7:extLst>
+                    </ns7:blip>
+                    <ns7:stretch>
+                      <ns7:fillRect/>
+                    </ns7:stretch>
+                  </ns8:blipFill>
+                  <ns8:spPr>
+                    <ns7:xfrm>
+                      <ns7:off x="0" y="0"/>
+                      <ns7:ext cx="4151193" cy="6724068"/>
+                    </ns7:xfrm>
+                    <ns7:prstGeom prst="rect">
+                      <ns7:avLst/>
+                    </ns7:prstGeom>
+                  </ns8:spPr>
+                </ns8:pic>
+              </ns7:graphicData>
+            </ns7:graphic>
           </wp:inline>
         </w:drawing>
       </w:r>
@@ -8747,35 +8747,35 @@
             <wp:effectExtent l="0" t="0" r="0" b="20955"/>
             <wp:docPr id="3" name="Picture 3"/>
             <wp:cNvGraphicFramePr>
-              <a:graphicFrameLocks xmlns:a="http://schemas.openxmlformats.org/drawingml/2006/main" noChangeAspect="1"/>
+              <ns7:graphicFrameLocks noChangeAspect="1"/>
             </wp:cNvGraphicFramePr>
-            <a:graphic xmlns:a="http://schemas.openxmlformats.org/drawingml/2006/main">
-              <a:graphicData uri="http://schemas.openxmlformats.org/drawingml/2006/picture">
-                <pic:pic xmlns:pic="http://schemas.openxmlformats.org/drawingml/2006/picture">
-                  <pic:nvPicPr>
-                    <pic:cNvPr id="3" name="Picture 3"/>
-                    <pic:cNvPicPr>
-                      <a:picLocks noChangeAspect="1"/>
-                    </pic:cNvPicPr>
-                  </pic:nvPicPr>
-                  <pic:blipFill>
-                    <a:blip r:embed="rId14"/>
-                    <a:stretch>
-                      <a:fillRect/>
-                    </a:stretch>
-                  </pic:blipFill>
-                  <pic:spPr>
-                    <a:xfrm>
-                      <a:off x="0" y="0"/>
-                      <a:ext cx="5486400" cy="2925623"/>
-                    </a:xfrm>
-                    <a:prstGeom prst="rect">
-                      <a:avLst/>
-                    </a:prstGeom>
-                  </pic:spPr>
-                </pic:pic>
-              </a:graphicData>
-            </a:graphic>
+            <ns7:graphic>
+              <ns7:graphicData uri="http://schemas.openxmlformats.org/drawingml/2006/picture">
+                <ns8:pic>
+                  <ns8:nvPicPr>
+                    <ns8:cNvPr id="3" name="Picture 3"/>
+                    <ns8:cNvPicPr>
+                      <ns7:picLocks noChangeAspect="1"/>
+                    </ns8:cNvPicPr>
+                  </ns8:nvPicPr>
+                  <ns8:blipFill>
+                    <ns7:blip r:embed="rId14"/>
+                    <ns7:stretch>
+                      <ns7:fillRect/>
+                    </ns7:stretch>
+                  </ns8:blipFill>
+                  <ns8:spPr>
+                    <ns7:xfrm>
+                      <ns7:off x="0" y="0"/>
+                      <ns7:ext cx="5486400" cy="2925623"/>
+                    </ns7:xfrm>
+                    <ns7:prstGeom prst="rect">
+                      <ns7:avLst/>
+                    </ns7:prstGeom>
+                  </ns8:spPr>
+                </ns8:pic>
+              </ns7:graphicData>
+            </ns7:graphic>
           </wp:inline>
         </w:drawing>
       </w:r>
@@ -8839,35 +8839,35 @@
             <wp:effectExtent l="0" t="0" r="0" b="3810"/>
             <wp:docPr id="4" name="Picture 4"/>
             <wp:cNvGraphicFramePr>
-              <a:graphicFrameLocks xmlns:a="http://schemas.openxmlformats.org/drawingml/2006/main" noChangeAspect="1"/>
+              <ns7:graphicFrameLocks noChangeAspect="1"/>
             </wp:cNvGraphicFramePr>
-            <a:graphic xmlns:a="http://schemas.openxmlformats.org/drawingml/2006/main">
-              <a:graphicData uri="http://schemas.openxmlformats.org/drawingml/2006/picture">
-                <pic:pic xmlns:pic="http://schemas.openxmlformats.org/drawingml/2006/picture">
-                  <pic:nvPicPr>
-                    <pic:cNvPr id="4" name="Picture 4"/>
-                    <pic:cNvPicPr>
-                      <a:picLocks noChangeAspect="1"/>
-                    </pic:cNvPicPr>
-                  </pic:nvPicPr>
-                  <pic:blipFill>
-                    <a:blip r:embed="rId15"/>
-                    <a:stretch>
-                      <a:fillRect/>
-                    </a:stretch>
-                  </pic:blipFill>
-                  <pic:spPr>
-                    <a:xfrm>
-                      <a:off x="0" y="0"/>
-                      <a:ext cx="5486400" cy="2968142"/>
-                    </a:xfrm>
-                    <a:prstGeom prst="rect">
-                      <a:avLst/>
-                    </a:prstGeom>
-                  </pic:spPr>
-                </pic:pic>
-              </a:graphicData>
-            </a:graphic>
+            <ns7:graphic>
+              <ns7:graphicData uri="http://schemas.openxmlformats.org/drawingml/2006/picture">
+                <ns8:pic>
+                  <ns8:nvPicPr>
+                    <ns8:cNvPr id="4" name="Picture 4"/>
+                    <ns8:cNvPicPr>
+                      <ns7:picLocks noChangeAspect="1"/>
+                    </ns8:cNvPicPr>
+                  </ns8:nvPicPr>
+                  <ns8:blipFill>
+                    <ns7:blip r:embed="rId15"/>
+                    <ns7:stretch>
+                      <ns7:fillRect/>
+                    </ns7:stretch>
+                  </ns8:blipFill>
+                  <ns8:spPr>
+                    <ns7:xfrm>
+                      <ns7:off x="0" y="0"/>
+                      <ns7:ext cx="5486400" cy="2968142"/>
+                    </ns7:xfrm>
+                    <ns7:prstGeom prst="rect">
+                      <ns7:avLst/>
+                    </ns7:prstGeom>
+                  </ns8:spPr>
+                </ns8:pic>
+              </ns7:graphicData>
+            </ns7:graphic>
           </wp:inline>
         </w:drawing>
       </w:r>
@@ -8930,35 +8930,35 @@
             <wp:effectExtent l="0" t="0" r="0" b="15875"/>
             <wp:docPr id="5" name="Picture 5"/>
             <wp:cNvGraphicFramePr>
-              <a:graphicFrameLocks xmlns:a="http://schemas.openxmlformats.org/drawingml/2006/main" noChangeAspect="1"/>
+              <ns7:graphicFrameLocks noChangeAspect="1"/>
             </wp:cNvGraphicFramePr>
-            <a:graphic xmlns:a="http://schemas.openxmlformats.org/drawingml/2006/main">
-              <a:graphicData uri="http://schemas.openxmlformats.org/drawingml/2006/picture">
-                <pic:pic xmlns:pic="http://schemas.openxmlformats.org/drawingml/2006/picture">
-                  <pic:nvPicPr>
-                    <pic:cNvPr id="5" name="Picture 5"/>
-                    <pic:cNvPicPr>
-                      <a:picLocks noChangeAspect="1"/>
-                    </pic:cNvPicPr>
-                  </pic:nvPicPr>
-                  <pic:blipFill>
-                    <a:blip r:embed="rId16"/>
-                    <a:stretch>
-                      <a:fillRect/>
-                    </a:stretch>
-                  </pic:blipFill>
-                  <pic:spPr>
-                    <a:xfrm>
-                      <a:off x="0" y="0"/>
-                      <a:ext cx="5486400" cy="3032608"/>
-                    </a:xfrm>
-                    <a:prstGeom prst="rect">
-                      <a:avLst/>
-                    </a:prstGeom>
-                  </pic:spPr>
-                </pic:pic>
-              </a:graphicData>
-            </a:graphic>
+            <ns7:graphic>
+              <ns7:graphicData uri="http://schemas.openxmlformats.org/drawingml/2006/picture">
+                <ns8:pic>
+                  <ns8:nvPicPr>
+                    <ns8:cNvPr id="5" name="Picture 5"/>
+                    <ns8:cNvPicPr>
+                      <ns7:picLocks noChangeAspect="1"/>
+                    </ns8:cNvPicPr>
+                  </ns8:nvPicPr>
+                  <ns8:blipFill>
+                    <ns7:blip r:embed="rId16"/>
+                    <ns7:stretch>
+                      <ns7:fillRect/>
+                    </ns7:stretch>
+                  </ns8:blipFill>
+                  <ns8:spPr>
+                    <ns7:xfrm>
+                      <ns7:off x="0" y="0"/>
+                      <ns7:ext cx="5486400" cy="3032608"/>
+                    </ns7:xfrm>
+                    <ns7:prstGeom prst="rect">
+                      <ns7:avLst/>
+                    </ns7:prstGeom>
+                  </ns8:spPr>
+                </ns8:pic>
+              </ns7:graphicData>
+            </ns7:graphic>
           </wp:inline>
         </w:drawing>
       </w:r>
@@ -10955,13 +10955,13 @@
                 <w:rFonts w:ascii="Consolas" w:eastAsia="Consolas" w:hAnsi="Consolas"/>
                 <w:sz w:val="21"/>
               </w:rPr>
-              <w:t>classification</w:t>
+              <w:t>AI 解析或人工确认后为 classification / regression</w:t>
             </w:r>
             <w:r>
               <w:rPr>
                 <w:sz w:val="21"/>
               </w:rPr>
-              <w:t xml:space="preserve"> 或 </w:t>
+              <w:t xml:space="preserve"/>
             </w:r>
             <w:r>
               <w:rPr>
@@ -10969,7 +10969,7 @@
                 <w:sz w:val="21"/>
               </w:rPr>
               <w:lastRenderedPageBreak/>
-              <w:t>regression</w:t>
+              <w:t/>
             </w:r>
           </w:p>
         </w:tc>
@@ -10987,7 +10987,7 @@
                 <w:sz w:val="21"/>
               </w:rPr>
               <w:lastRenderedPageBreak/>
-              <w:t>是</w:t>
+              <w:t>否（创建时可为空，上传 CSV 后由 AI 解析或人工确认后回写）</w:t>
             </w:r>
           </w:p>
         </w:tc>
@@ -21441,7 +21441,7 @@
           </w:tcPr>
           <w:p>
             <w:r>
-              <w:t>分类或回归</w:t>
+              <w:t>分类或回归，创建时可为空</w:t>
             </w:r>
           </w:p>
         </w:tc>
@@ -21452,7 +21452,7 @@
           </w:tcPr>
           <w:p>
             <w:r>
-              <w:t>取值 classification / regression</w:t>
+              <w:t>AI 解析或人工确认后取值 classification / regression</w:t>
             </w:r>
           </w:p>
         </w:tc>

</xml_diff>